<commit_message>
Add front cover for the novel draft and place it in the Word manuscript
Co-Authored-By: Claude Opus 5.5 <noreply@anthropic.com>
Claude-Session: https://claude.ai/code/session_01JTvKFd7Y96vrFKGKKK4tvp
</commit_message>
<xml_diff>
--- a/제7조_초고.docx
+++ b/제7조_초고.docx
@@ -2,6 +2,69 @@
 <file path=word/document.xml><?xml version="1.0" encoding="utf-8"?>
 <w:document xmlns:wpc="http://schemas.microsoft.com/office/word/2010/wordprocessingCanvas" xmlns:mc="http://schemas.openxmlformats.org/markup-compatibility/2006" xmlns:o="urn:schemas-microsoft-com:office:office" xmlns:r="http://schemas.openxmlformats.org/officeDocument/2006/relationships" xmlns:m="http://schemas.openxmlformats.org/officeDocument/2006/math" xmlns:v="urn:schemas-microsoft-com:vml" xmlns:wp14="http://schemas.microsoft.com/office/word/2010/wordprocessingDrawing" xmlns:wp="http://schemas.openxmlformats.org/drawingml/2006/wordprocessingDrawing" xmlns:w10="urn:schemas-microsoft-com:office:word" xmlns:w="http://schemas.openxmlformats.org/wordprocessingml/2006/main" xmlns:w14="http://schemas.microsoft.com/office/word/2010/wordml" xmlns:w15="http://schemas.microsoft.com/office/word/2012/wordml" xmlns:wpg="http://schemas.microsoft.com/office/word/2010/wordprocessingGroup" xmlns:wpi="http://schemas.microsoft.com/office/word/2010/wordprocessingInk" xmlns:wne="http://schemas.microsoft.com/office/word/2006/wordml" xmlns:wps="http://schemas.microsoft.com/office/word/2010/wordprocessingShape" xmlns:cx="http://schemas.microsoft.com/office/drawing/2014/chartex" xmlns:cx1="http://schemas.microsoft.com/office/drawing/2015/9/8/chartex" xmlns:cx2="http://schemas.microsoft.com/office/drawing/2015/10/21/chartex" xmlns:cx3="http://schemas.microsoft.com/office/drawing/2016/5/9/chartex" xmlns:cx4="http://schemas.microsoft.com/office/drawing/2016/5/10/chartex" xmlns:cx5="http://schemas.microsoft.com/office/drawing/2016/5/11/chartex" xmlns:cx6="http://schemas.microsoft.com/office/drawing/2016/5/12/chartex" xmlns:cx7="http://schemas.microsoft.com/office/drawing/2016/5/13/chartex" xmlns:cx8="http://schemas.microsoft.com/office/drawing/2016/5/14/chartex" xmlns:aink="http://schemas.microsoft.com/office/drawing/2016/ink" xmlns:am3d="http://schemas.microsoft.com/office/drawing/2017/model3d" xmlns:w16cex="http://schemas.microsoft.com/office/word/2018/wordml/cex" xmlns:w16cid="http://schemas.microsoft.com/office/word/2016/wordml/cid" xmlns:w16="http://schemas.microsoft.com/office/word/2018/wordml" xmlns:w16sdtdh="http://schemas.microsoft.com/office/word/2020/wordml/sdtdatahash" xmlns:w16se="http://schemas.microsoft.com/office/word/2015/wordml/symex" mc:Ignorable="w14 w15 wp14">
   <w:body>
+    <w:p>
+      <w:pPr>
+        <w:spacing w:after="0" w:before="0" w:line="240"/>
+      </w:pPr>
+      <w:r>
+        <w:drawing>
+          <wp:anchor distT="0" distB="0" distL="0" distR="0" simplePos="0" allowOverlap="1" behindDoc="1" locked="0" layoutInCell="1" relativeHeight="8096250">
+            <wp:simplePos x="0" y="0"/>
+            <wp:positionH relativeFrom="page">
+              <wp:posOffset>0</wp:posOffset>
+            </wp:positionH>
+            <wp:positionV relativeFrom="page">
+              <wp:posOffset>0</wp:posOffset>
+            </wp:positionV>
+            <wp:extent cx="5467350" cy="8096250"/>
+            <wp:effectExtent t="0" r="0" b="0" l="0"/>
+            <wp:wrapNone/>
+            <wp:docPr id="1" name="" descr="" title=""/>
+            <wp:cNvGraphicFramePr>
+              <a:graphicFrameLocks xmlns:a="http://schemas.openxmlformats.org/drawingml/2006/main" noChangeAspect="1"/>
+            </wp:cNvGraphicFramePr>
+            <a:graphic xmlns:a="http://schemas.openxmlformats.org/drawingml/2006/main">
+              <a:graphicData uri="http://schemas.openxmlformats.org/drawingml/2006/picture">
+                <pic:pic xmlns:pic="http://schemas.openxmlformats.org/drawingml/2006/picture">
+                  <pic:nvPicPr>
+                    <pic:cNvPr id="0" name="" descr=""/>
+                    <pic:cNvPicPr>
+                      <a:picLocks noChangeAspect="1" noChangeArrowheads="1"/>
+                    </pic:cNvPicPr>
+                  </pic:nvPicPr>
+                  <pic:blipFill>
+                    <a:blip r:embed="rId10" cstate="none"/>
+                    <a:srcRect/>
+                    <a:stretch>
+                      <a:fillRect/>
+                    </a:stretch>
+                  </pic:blipFill>
+                  <pic:spPr bwMode="auto">
+                    <a:xfrm>
+                      <a:off x="0" y="0"/>
+                      <a:ext cx="5467350" cy="8096250"/>
+                    </a:xfrm>
+                    <a:prstGeom prst="rect">
+                      <a:avLst/>
+                    </a:prstGeom>
+                  </pic:spPr>
+                </pic:pic>
+              </a:graphicData>
+            </a:graphic>
+          </wp:anchor>
+        </w:drawing>
+      </w:r>
+    </w:p>
+    <w:p>
+      <w:pPr>
+        <w:sectPr>
+          <w:pgSz w:w="8617" w:h="12756" w:orient="portrait"/>
+          <w:pgMar w:top="0" w:right="0" w:bottom="0" w:left="0" w:header="0" w:footer="0" w:gutter="0"/>
+          <w:pgNumType/>
+          <w:docGrid w:linePitch="360"/>
+        </w:sectPr>
+      </w:pPr>
+    </w:p>
     <w:p>
       <w:pPr>
         <w:spacing w:before="2400"/>
@@ -244,6 +307,7 @@
     <w:p>
       <w:pPr>
         <w:sectPr>
+          <w:type w:val="nextPage"/>
           <w:pgSz w:w="8617" w:h="12756" w:orient="portrait"/>
           <w:pgMar w:top="1474" w:right="1134" w:bottom="1361" w:left="1361" w:header="567" w:footer="510" w:gutter="0"/>
           <w:pgNumType/>

</xml_diff>